<commit_message>
docs(lab1): move SRS use case figure to appendix
</commit_message>
<xml_diff>
--- a/实验一_智能化需求工程与UML建模/03_软件需求规格说明书_SRS.docx
+++ b/实验一_智能化需求工程与UML建模/03_软件需求规格说明书_SRS.docx
@@ -826,53 +826,6 @@
             <w:pPr>
               <w:spacing w:before="0" w:after="0"/>
             </w:pPr>
-          </w:p>
-          <w:p>
-            <w:pPr>
-              <w:jc w:val="center"/>
-            </w:pPr>
-            <w:r>
-              <w:drawing>
-                <wp:inline xmlns:a="http://schemas.openxmlformats.org/drawingml/2006/main" xmlns:pic="http://schemas.openxmlformats.org/drawingml/2006/picture">
-                  <wp:extent cx="4983480" cy="2958941"/>
-                  <wp:docPr id="1" name="Picture 1"/>
-                  <wp:cNvGraphicFramePr>
-                    <a:graphicFrameLocks noChangeAspect="1"/>
-                  </wp:cNvGraphicFramePr>
-                  <a:graphic>
-                    <a:graphicData uri="http://schemas.openxmlformats.org/drawingml/2006/picture">
-                      <pic:pic>
-                        <pic:nvPicPr>
-                          <pic:cNvPr id="0" name="image.png"/>
-                          <pic:cNvPicPr/>
-                        </pic:nvPicPr>
-                        <pic:blipFill>
-                          <a:blip r:embed="rId9"/>
-                          <a:stretch>
-                            <a:fillRect/>
-                          </a:stretch>
-                        </pic:blipFill>
-                        <pic:spPr>
-                          <a:xfrm>
-                            <a:off x="0" y="0"/>
-                            <a:ext cx="4983480" cy="2958941"/>
-                          </a:xfrm>
-                          <a:prstGeom prst="rect"/>
-                        </pic:spPr>
-                      </pic:pic>
-                    </a:graphicData>
-                  </a:graphic>
-                </wp:inline>
-              </w:drawing>
-            </w:r>
-          </w:p>
-          <w:p>
-            <w:pPr>
-              <w:jc w:val="center"/>
-            </w:pPr>
-            <w:r>
-              <w:t>图1-2 NekoCafé 核心用例总览</w:t>
-            </w:r>
           </w:p>
         </w:tc>
       </w:tr>
@@ -1865,6 +1818,53 @@
               <w:t>主用例图源文件：04_UML模型集/usecase/主用例图.puml；子用例图：子用例_预约.puml、子用例_会员.puml。导出图统一存放于 04_UML模型集/exports。</w:t>
             </w:r>
           </w:p>
+          <w:p>
+            <w:pPr>
+              <w:jc w:val="center"/>
+            </w:pPr>
+            <w:r>
+              <w:drawing>
+                <wp:inline xmlns:a="http://schemas.openxmlformats.org/drawingml/2006/main" xmlns:pic="http://schemas.openxmlformats.org/drawingml/2006/picture">
+                  <wp:extent cx="4983480" cy="2958941"/>
+                  <wp:docPr id="1" name="Picture 1"/>
+                  <wp:cNvGraphicFramePr>
+                    <a:graphicFrameLocks noChangeAspect="1"/>
+                  </wp:cNvGraphicFramePr>
+                  <a:graphic>
+                    <a:graphicData uri="http://schemas.openxmlformats.org/drawingml/2006/picture">
+                      <pic:pic>
+                        <pic:nvPicPr>
+                          <pic:cNvPr id="0" name="image.png"/>
+                          <pic:cNvPicPr/>
+                        </pic:nvPicPr>
+                        <pic:blipFill>
+                          <a:blip r:embed="rId9"/>
+                          <a:stretch>
+                            <a:fillRect/>
+                          </a:stretch>
+                        </pic:blipFill>
+                        <pic:spPr>
+                          <a:xfrm>
+                            <a:off x="0" y="0"/>
+                            <a:ext cx="4983480" cy="2958941"/>
+                          </a:xfrm>
+                          <a:prstGeom prst="rect"/>
+                        </pic:spPr>
+                      </pic:pic>
+                    </a:graphicData>
+                  </a:graphic>
+                </wp:inline>
+              </w:drawing>
+            </w:r>
+          </w:p>
+          <w:p>
+            <w:pPr>
+              <w:jc w:val="center"/>
+            </w:pPr>
+            <w:r>
+              <w:t>图1-2 NekoCafé 核心用例总览</w:t>
+            </w:r>
+          </w:p>
         </w:tc>
       </w:tr>
     </w:tbl>

</xml_diff>